<commit_message>
Evaluating LLM-Based Credit Rating Systems: A Pre-Registered Specification-Curve Analysis
</commit_message>
<xml_diff>
--- a/paper/ISWA/cas-sc.docx
+++ b/paper/ISWA/cas-sc.docx
@@ -2394,13 +2394,13 @@
         <w:t xml:space="preserve"> </w:t>
       </w:r>
       <w:r>
-        <w:t xml:space="preserve">(Wu et al., 2023; Xie et al., 2023) language models have been evaluated for financial-statement</w:t>
-      </w:r>
-      <w:r>
-        <w:t xml:space="preserve"> </w:t>
-      </w:r>
-      <w:r>
-        <w:t xml:space="preserve">analysis (Kim et al., 2024), return prediction (Lopez-Lira and Tang, 2023), analysis of central-bank</w:t>
+        <w:t xml:space="preserve">(Wu et al., 2023; Xie et al., 2023) language models have been evaluated for</w:t>
+      </w:r>
+      <w:r>
+        <w:t xml:space="preserve"> </w:t>
+      </w:r>
+      <w:r>
+        <w:t xml:space="preserve">return prediction (Lopez-Lira and Tang, 2023), analysis of central-bank</w:t>
       </w:r>
       <w:r>
         <w:t xml:space="preserve"> </w:t>
@@ -4098,48 +4098,126 @@
       <w:pPr>
         <w:pStyle w:val="CaptionedFigure"/>
       </w:pPr>
-      <w:bookmarkStart w:id="36" w:name="fig:ighy"/>
-      <w:r>
-        <w:drawing>
-          <wp:inline>
-            <wp:extent cx="5146371" cy="3124582"/>
-            <wp:effectExtent b="0" l="0" r="0" t="0"/>
-            <wp:docPr descr="Share of matched elicitation pairs whose credit verdicts differ, by rating granularity, where the two elicitations of a firm may differ on any grid axis (provider, model version, temperature, paraphrase, format, few-shot, presentation) and seed. Even at the coarse investment-grade/high-yield split, the most consequential line in credit, about 25% of matched pairs disagree." title="" id="1" name="Picture"/>
-            <a:graphic>
-              <a:graphicData uri="http://schemas.openxmlformats.org/drawingml/2006/picture">
-                <pic:pic>
-                  <pic:nvPicPr>
-                    <pic:cNvPr descr="figure1_ighy.png" id="0" name="Picture"/>
-                    <pic:cNvPicPr>
-                      <a:picLocks noChangeArrowheads="1" noChangeAspect="1"/>
-                    </pic:cNvPicPr>
-                  </pic:nvPicPr>
-                  <pic:blipFill>
-                    <a:blip r:embed="rId35"/>
-                    <a:stretch>
-                      <a:fillRect/>
-                    </a:stretch>
-                  </pic:blipFill>
-                  <pic:spPr bwMode="auto">
-                    <a:xfrm>
-                      <a:off x="0" y="0"/>
-                      <a:ext cx="5146371" cy="3124582"/>
-                    </a:xfrm>
-                    <a:prstGeom prst="rect">
-                      <a:avLst/>
-                    </a:prstGeom>
-                    <a:noFill/>
-                    <a:ln w="9525">
-                      <a:noFill/>
-                      <a:headEnd/>
-                      <a:tailEnd/>
-                    </a:ln>
-                  </pic:spPr>
-                </pic:pic>
-              </a:graphicData>
-            </a:graphic>
-          </wp:inline>
-        </w:drawing>
+      <w:bookmarkStart w:id="35" w:name="fig:ighy"/>
+      <w:r>
+        <w:t xml:space="preserve">Share of matched elicitation pairs whose credit verdicts differ, by rating granularity, where</w:t>
+      </w:r>
+      <w:r>
+        <w:t xml:space="preserve"> </w:t>
+      </w:r>
+      <w:r>
+        <w:t xml:space="preserve">the two elicitations of a firm may differ on any grid axis (provider, model version, temperature,</w:t>
+      </w:r>
+      <w:r>
+        <w:t xml:space="preserve"> </w:t>
+      </w:r>
+      <w:r>
+        <w:t xml:space="preserve">paraphrase, format, few-shot, presentation) and seed. Even at the coarse investment-grade/high-yield</w:t>
+      </w:r>
+      <w:r>
+        <w:t xml:space="preserve"> </w:t>
+      </w:r>
+      <w:r>
+        <w:t xml:space="preserve">split, the most consequential line in credit, about 25% of matched pairs disagree.</w:t>
+      </w:r>
+      <w:bookmarkEnd w:id="35"/>
+    </w:p>
+    <w:p>
+      <w:pPr>
+        <w:pStyle w:val="ImageCaption"/>
+      </w:pPr>
+      <w:r>
+        <w:t xml:space="preserve">Share of matched elicitation pairs whose credit verdicts differ, by rating granularity, where</w:t>
+      </w:r>
+      <w:r>
+        <w:t xml:space="preserve"> </w:t>
+      </w:r>
+      <w:r>
+        <w:t xml:space="preserve">the two elicitations of a firm may differ on any grid axis (provider, model version, temperature,</w:t>
+      </w:r>
+      <w:r>
+        <w:t xml:space="preserve"> </w:t>
+      </w:r>
+      <w:r>
+        <w:t xml:space="preserve">paraphrase, format, few-shot, presentation) and seed. Even at the coarse investment-grade/high-yield</w:t>
+      </w:r>
+      <w:r>
+        <w:t xml:space="preserve"> </w:t>
+      </w:r>
+      <w:r>
+        <w:t xml:space="preserve">split, the most consequential line in credit, about 25% of matched pairs disagree.</w:t>
+      </w:r>
+    </w:p>
+    <w:p>
+      <w:pPr>
+        <w:pStyle w:val="CaptionedFigure"/>
+      </w:pPr>
+      <w:bookmarkStart w:id="36" w:name="fig:kappa"/>
+      <w:r>
+        <w:t xml:space="preserve">Chance-corrected cross-specification agreement (unweighted Fleiss</w:t>
+      </w:r>
+      <w:r>
+        <w:t xml:space="preserve"> </w:t>
+      </w:r>
+      <m:oMath>
+        <m:r>
+          <m:t>κ</m:t>
+        </m:r>
+      </m:oMath>
+      <w:r>
+        <w:t xml:space="preserve">) by granularity;</w:t>
+      </w:r>
+      <w:r>
+        <w:t xml:space="preserve"> </w:t>
+      </w:r>
+      <w:r>
+        <w:t xml:space="preserve">agreement peaks at 0.49 on the IG/HY split and no resolution reaches the</w:t>
+      </w:r>
+      <w:r>
+        <w:t xml:space="preserve"> </w:t>
+      </w:r>
+      <m:oMath>
+        <m:r>
+          <m:t>κ</m:t>
+        </m:r>
+        <m:r>
+          <m:t>=</m:t>
+        </m:r>
+        <m:r>
+          <m:t>0.6</m:t>
+        </m:r>
+      </m:oMath>
+      <w:r>
+        <w:t xml:space="preserve"> </w:t>
+      </w:r>
+      <w:r>
+        <w:t xml:space="preserve">substantial</w:t>
+      </w:r>
+      <w:r>
+        <w:t xml:space="preserve"> </w:t>
+      </w:r>
+      <w:r>
+        <w:t xml:space="preserve">threshold under unweighted scoring. Ordinal weighting raises letter-scale agreement (Krippendorff’s</w:t>
+      </w:r>
+      <w:r>
+        <w:t xml:space="preserve"> </w:t>
+      </w:r>
+      <m:oMath>
+        <m:r>
+          <m:t>α</m:t>
+        </m:r>
+        <m:r>
+          <m:t>=</m:t>
+        </m:r>
+        <m:r>
+          <m:t>0.65</m:t>
+        </m:r>
+      </m:oMath>
+      <w:r>
+        <w:t xml:space="preserve"> </w:t>
+      </w:r>
+      <w:r>
+        <w:t xml:space="preserve">quadratic), but the binary IG/HY flip is unaffected by weighting.</w:t>
       </w:r>
       <w:bookmarkEnd w:id="36"/>
     </w:p>
@@ -4148,81 +4226,6 @@
         <w:pStyle w:val="ImageCaption"/>
       </w:pPr>
       <w:r>
-        <w:t xml:space="preserve">Share of matched elicitation pairs whose credit verdicts differ, by rating granularity, where</w:t>
-      </w:r>
-      <w:r>
-        <w:t xml:space="preserve"> </w:t>
-      </w:r>
-      <w:r>
-        <w:t xml:space="preserve">the two elicitations of a firm may differ on any grid axis (provider, model version, temperature,</w:t>
-      </w:r>
-      <w:r>
-        <w:t xml:space="preserve"> </w:t>
-      </w:r>
-      <w:r>
-        <w:t xml:space="preserve">paraphrase, format, few-shot, presentation) and seed. Even at the coarse investment-grade/high-yield</w:t>
-      </w:r>
-      <w:r>
-        <w:t xml:space="preserve"> </w:t>
-      </w:r>
-      <w:r>
-        <w:t xml:space="preserve">split, the most consequential line in credit, about 25% of matched pairs disagree.</w:t>
-      </w:r>
-    </w:p>
-    <w:p>
-      <w:pPr>
-        <w:pStyle w:val="CaptionedFigure"/>
-      </w:pPr>
-      <w:bookmarkStart w:id="38" w:name="fig:kappa"/>
-      <w:r>
-        <w:drawing>
-          <wp:inline>
-            <wp:extent cx="5146371" cy="3124582"/>
-            <wp:effectExtent b="0" l="0" r="0" t="0"/>
-            <wp:docPr descr="Chance-corrected cross-specification agreement (unweighted Fleiss \kappa) by granularity; agreement peaks at 0.49 on the IG/HY split and no resolution reaches the \kappa=0.6 substantial threshold under unweighted scoring. Ordinal weighting raises letter-scale agreement (Krippendorff’s \alpha=0.65 quadratic), but the binary IG/HY flip is unaffected by weighting." title="" id="1" name="Picture"/>
-            <a:graphic>
-              <a:graphicData uri="http://schemas.openxmlformats.org/drawingml/2006/picture">
-                <pic:pic>
-                  <pic:nvPicPr>
-                    <pic:cNvPr descr="figureA_kappa.png" id="0" name="Picture"/>
-                    <pic:cNvPicPr>
-                      <a:picLocks noChangeArrowheads="1" noChangeAspect="1"/>
-                    </pic:cNvPicPr>
-                  </pic:nvPicPr>
-                  <pic:blipFill>
-                    <a:blip r:embed="rId37"/>
-                    <a:stretch>
-                      <a:fillRect/>
-                    </a:stretch>
-                  </pic:blipFill>
-                  <pic:spPr bwMode="auto">
-                    <a:xfrm>
-                      <a:off x="0" y="0"/>
-                      <a:ext cx="5146371" cy="3124582"/>
-                    </a:xfrm>
-                    <a:prstGeom prst="rect">
-                      <a:avLst/>
-                    </a:prstGeom>
-                    <a:noFill/>
-                    <a:ln w="9525">
-                      <a:noFill/>
-                      <a:headEnd/>
-                      <a:tailEnd/>
-                    </a:ln>
-                  </pic:spPr>
-                </pic:pic>
-              </a:graphicData>
-            </a:graphic>
-          </wp:inline>
-        </w:drawing>
-      </w:r>
-      <w:bookmarkEnd w:id="38"/>
-    </w:p>
-    <w:p>
-      <w:pPr>
-        <w:pStyle w:val="ImageCaption"/>
-      </w:pPr>
-      <w:r>
         <w:t xml:space="preserve">Chance-corrected cross-specification agreement (unweighted Fleiss</w:t>
       </w:r>
       <w:r>
@@ -4293,11 +4296,11 @@
       <w:pPr>
         <w:pStyle w:val="Heading2"/>
       </w:pPr>
-      <w:bookmarkStart w:id="39" w:name="X550f5210f40dfd123c9f40984dcf8431bc8b469"/>
+      <w:bookmarkStart w:id="37" w:name="X550f5210f40dfd123c9f40984dcf8431bc8b469"/>
       <w:r>
         <w:t xml:space="preserve">Economic implications of elicitation instability</w:t>
       </w:r>
-      <w:bookmarkEnd w:id="39"/>
+      <w:bookmarkEnd w:id="37"/>
     </w:p>
     <w:p>
       <w:pPr>
@@ -4517,7 +4520,7 @@
         <w:t xml:space="preserve">).</w:t>
       </w:r>
     </w:p>
-    <w:bookmarkStart w:id="40" w:name="tab:frag"/>
+    <w:bookmarkStart w:id="38" w:name="tab:frag"/>
     <w:p>
       <w:pPr>
         <w:pStyle w:val="TableCaption"/>
@@ -4885,16 +4888,16 @@
         </w:tc>
       </w:tr>
     </w:tbl>
-    <w:bookmarkEnd w:id="40"/>
+    <w:bookmarkEnd w:id="38"/>
     <w:p>
       <w:pPr>
         <w:pStyle w:val="Heading2"/>
       </w:pPr>
-      <w:bookmarkStart w:id="41" w:name="sec:realarm"/>
+      <w:bookmarkStart w:id="39" w:name="sec:realarm"/>
       <w:r>
         <w:t xml:space="preserve">Robustness on decontaminated real issuers</w:t>
       </w:r>
-      <w:bookmarkEnd w:id="41"/>
+      <w:bookmarkEnd w:id="39"/>
     </w:p>
     <w:p>
       <w:pPr>
@@ -5140,7 +5143,7 @@
         <w:t xml:space="preserve">three bands, but far from reliable agreement.</w:t>
       </w:r>
     </w:p>
-    <w:bookmarkStart w:id="42" w:name="tab:realarm"/>
+    <w:bookmarkStart w:id="40" w:name="tab:realarm"/>
     <w:p>
       <w:pPr>
         <w:pStyle w:val="TableCaption"/>
@@ -5481,16 +5484,16 @@
         </w:tc>
       </w:tr>
     </w:tbl>
-    <w:bookmarkEnd w:id="42"/>
+    <w:bookmarkEnd w:id="40"/>
     <w:p>
       <w:pPr>
         <w:pStyle w:val="Heading2"/>
       </w:pPr>
-      <w:bookmarkStart w:id="43" w:name="sec:tier"/>
+      <w:bookmarkStart w:id="41" w:name="sec:tier"/>
       <w:r>
         <w:t xml:space="preserve">Robustness across model tiers (post-hoc)</w:t>
       </w:r>
-      <w:bookmarkEnd w:id="43"/>
+      <w:bookmarkEnd w:id="41"/>
     </w:p>
     <w:p>
       <w:pPr>
@@ -5828,7 +5831,7 @@
         <w:t xml:space="preserve">not better benchmark agreement.</w:t>
       </w:r>
     </w:p>
-    <w:bookmarkStart w:id="44" w:name="tab:tier"/>
+    <w:bookmarkStart w:id="42" w:name="tab:tier"/>
     <w:p>
       <w:pPr>
         <w:pStyle w:val="TableCaption"/>
@@ -6286,16 +6289,16 @@
         </w:tc>
       </w:tr>
     </w:tbl>
-    <w:bookmarkEnd w:id="44"/>
+    <w:bookmarkEnd w:id="42"/>
     <w:p>
       <w:pPr>
         <w:pStyle w:val="Heading2"/>
       </w:pPr>
-      <w:bookmarkStart w:id="45" w:name="sec:selfcons"/>
+      <w:bookmarkStart w:id="43" w:name="sec:selfcons"/>
       <w:r>
         <w:t xml:space="preserve">Self-consistency: does aggregation remove the instability? (post-hoc)</w:t>
       </w:r>
-      <w:bookmarkEnd w:id="45"/>
+      <w:bookmarkEnd w:id="43"/>
     </w:p>
     <w:p>
       <w:pPr>
@@ -6538,50 +6541,54 @@
       <w:pPr>
         <w:pStyle w:val="CaptionedFigure"/>
       </w:pPr>
-      <w:bookmarkStart w:id="47" w:name="fig:selfcons"/>
-      <w:r>
-        <w:drawing>
-          <wp:inline>
-            <wp:extent cx="5146371" cy="3124582"/>
-            <wp:effectExtent b="0" l="0" r="0" t="0"/>
-            <wp:docPr descr="Self-consistency curve: residual per-comparison IG/HY flip after aggregating k elicitations per issuer by majority vote. Aggregation lowers instability with diminishing returns and does not eliminate it, about 11% of matched assessments still cross the boundary at k=15." title="" id="1" name="Picture"/>
-            <a:graphic>
-              <a:graphicData uri="http://schemas.openxmlformats.org/drawingml/2006/picture">
-                <pic:pic>
-                  <pic:nvPicPr>
-                    <pic:cNvPr descr="fig_selfconsistency.png" id="0" name="Picture"/>
-                    <pic:cNvPicPr>
-                      <a:picLocks noChangeArrowheads="1" noChangeAspect="1"/>
-                    </pic:cNvPicPr>
-                  </pic:nvPicPr>
-                  <pic:blipFill>
-                    <a:blip r:embed="rId46"/>
-                    <a:stretch>
-                      <a:fillRect/>
-                    </a:stretch>
-                  </pic:blipFill>
-                  <pic:spPr bwMode="auto">
-                    <a:xfrm>
-                      <a:off x="0" y="0"/>
-                      <a:ext cx="5146371" cy="3124582"/>
-                    </a:xfrm>
-                    <a:prstGeom prst="rect">
-                      <a:avLst/>
-                    </a:prstGeom>
-                    <a:noFill/>
-                    <a:ln w="9525">
-                      <a:noFill/>
-                      <a:headEnd/>
-                      <a:tailEnd/>
-                    </a:ln>
-                  </pic:spPr>
-                </pic:pic>
-              </a:graphicData>
-            </a:graphic>
-          </wp:inline>
-        </w:drawing>
-      </w:r>
-      <w:bookmarkEnd w:id="47"/>
+      <w:bookmarkStart w:id="44" w:name="fig:selfcons"/>
+      <w:r>
+        <w:t xml:space="preserve">Self-consistency curve: residual per-comparison IG/HY flip after aggregating</w:t>
+      </w:r>
+      <w:r>
+        <w:t xml:space="preserve"> </w:t>
+      </w:r>
+      <m:oMath>
+        <m:r>
+          <m:t>k</m:t>
+        </m:r>
+      </m:oMath>
+      <w:r>
+        <w:t xml:space="preserve"> </w:t>
+      </w:r>
+      <w:r>
+        <w:t xml:space="preserve">elicitations</w:t>
+      </w:r>
+      <w:r>
+        <w:t xml:space="preserve"> </w:t>
+      </w:r>
+      <w:r>
+        <w:t xml:space="preserve">per issuer by majority vote. Aggregation lowers instability with diminishing returns and does not</w:t>
+      </w:r>
+      <w:r>
+        <w:t xml:space="preserve"> </w:t>
+      </w:r>
+      <w:r>
+        <w:t xml:space="preserve">eliminate it, about 11% of matched assessments still cross the boundary at</w:t>
+      </w:r>
+      <w:r>
+        <w:t xml:space="preserve"> </w:t>
+      </w:r>
+      <m:oMath>
+        <m:r>
+          <m:t>k</m:t>
+        </m:r>
+        <m:r>
+          <m:t>=</m:t>
+        </m:r>
+        <m:r>
+          <m:t>15</m:t>
+        </m:r>
+      </m:oMath>
+      <w:r>
+        <w:t xml:space="preserve">.</w:t>
+      </w:r>
+      <w:bookmarkEnd w:id="44"/>
     </w:p>
     <w:p>
       <w:pPr>
@@ -6638,11 +6645,11 @@
       <w:pPr>
         <w:pStyle w:val="Heading1"/>
       </w:pPr>
-      <w:bookmarkStart w:id="48" w:name="sec:sis"/>
+      <w:bookmarkStart w:id="45" w:name="sec:sis"/>
       <w:r>
         <w:t xml:space="preserve">A specification-instability score for model-risk control</w:t>
       </w:r>
-      <w:bookmarkEnd w:id="48"/>
+      <w:bookmarkEnd w:id="45"/>
     </w:p>
     <w:p>
       <w:pPr>
@@ -6680,11 +6687,11 @@
       <w:pPr>
         <w:pStyle w:val="Heading2"/>
       </w:pPr>
-      <w:bookmarkStart w:id="49" w:name="definition"/>
+      <w:bookmarkStart w:id="46" w:name="definition"/>
       <w:r>
         <w:t xml:space="preserve">Definition</w:t>
       </w:r>
-      <w:bookmarkEnd w:id="49"/>
+      <w:bookmarkEnd w:id="46"/>
     </w:p>
     <w:p>
       <w:pPr>
@@ -7075,11 +7082,11 @@
       <w:pPr>
         <w:pStyle w:val="Heading2"/>
       </w:pPr>
-      <w:bookmarkStart w:id="50" w:name="sec:sis-val"/>
+      <w:bookmarkStart w:id="47" w:name="sec:sis-val"/>
       <w:r>
         <w:t xml:space="preserve">Post-hoc validation on held-out specifications</w:t>
       </w:r>
-      <w:bookmarkEnd w:id="50"/>
+      <w:bookmarkEnd w:id="47"/>
     </w:p>
     <w:p>
       <w:pPr>
@@ -7438,11 +7445,11 @@
       <w:pPr>
         <w:pStyle w:val="Heading2"/>
       </w:pPr>
-      <w:bookmarkStart w:id="51" w:name="sec:sis-cost"/>
+      <w:bookmarkStart w:id="48" w:name="sec:sis-cost"/>
       <w:r>
         <w:t xml:space="preserve">Deployment: aggregation level and cost</w:t>
       </w:r>
-      <w:bookmarkEnd w:id="51"/>
+      <w:bookmarkEnd w:id="48"/>
     </w:p>
     <w:p>
       <w:pPr>
@@ -7675,7 +7682,7 @@
         <w:t xml:space="preserve">additional elicitations.</w:t>
       </w:r>
     </w:p>
-    <w:bookmarkStart w:id="52" w:name="tab:cost"/>
+    <w:bookmarkStart w:id="49" w:name="tab:cost"/>
     <w:p>
       <w:pPr>
         <w:pStyle w:val="TableCaption"/>
@@ -8057,7 +8064,7 @@
         </w:tc>
       </w:tr>
     </w:tbl>
-    <w:bookmarkEnd w:id="52"/>
+    <w:bookmarkEnd w:id="49"/>
     <w:p>
       <w:pPr>
         <w:pStyle w:val="BodyText"/>
@@ -8082,11 +8089,11 @@
       <w:pPr>
         <w:pStyle w:val="Heading2"/>
       </w:pPr>
-      <w:bookmarkStart w:id="53" w:name="sec:sis-gov"/>
+      <w:bookmarkStart w:id="50" w:name="sec:sis-gov"/>
       <w:r>
         <w:t xml:space="preserve">Governance workflow</w:t>
       </w:r>
-      <w:bookmarkEnd w:id="53"/>
+      <w:bookmarkEnd w:id="50"/>
     </w:p>
     <w:p>
       <w:pPr>
@@ -8170,50 +8177,31 @@
       <w:pPr>
         <w:pStyle w:val="CaptionedFigure"/>
       </w:pPr>
-      <w:bookmarkStart w:id="55" w:name="fig:governance"/>
-      <w:r>
-        <w:drawing>
-          <wp:inline>
-            <wp:extent cx="5275031" cy="1277403"/>
-            <wp:effectExtent b="0" l="0" r="0" t="0"/>
-            <wp:docPr descr="Governance workflow. Each issuer is elicited k times; the modal rating and specification-instability score are recorded; issuers that are both near a consequential boundary and unstable are routed to review." title="" id="1" name="Picture"/>
-            <a:graphic>
-              <a:graphicData uri="http://schemas.openxmlformats.org/drawingml/2006/picture">
-                <pic:pic>
-                  <pic:nvPicPr>
-                    <pic:cNvPr descr="fig_governance.png" id="0" name="Picture"/>
-                    <pic:cNvPicPr>
-                      <a:picLocks noChangeArrowheads="1" noChangeAspect="1"/>
-                    </pic:cNvPicPr>
-                  </pic:nvPicPr>
-                  <pic:blipFill>
-                    <a:blip r:embed="rId54"/>
-                    <a:stretch>
-                      <a:fillRect/>
-                    </a:stretch>
-                  </pic:blipFill>
-                  <pic:spPr bwMode="auto">
-                    <a:xfrm>
-                      <a:off x="0" y="0"/>
-                      <a:ext cx="5275031" cy="1277403"/>
-                    </a:xfrm>
-                    <a:prstGeom prst="rect">
-                      <a:avLst/>
-                    </a:prstGeom>
-                    <a:noFill/>
-                    <a:ln w="9525">
-                      <a:noFill/>
-                      <a:headEnd/>
-                      <a:tailEnd/>
-                    </a:ln>
-                  </pic:spPr>
-                </pic:pic>
-              </a:graphicData>
-            </a:graphic>
-          </wp:inline>
-        </w:drawing>
-      </w:r>
-      <w:bookmarkEnd w:id="55"/>
+      <w:bookmarkStart w:id="51" w:name="fig:governance"/>
+      <w:r>
+        <w:t xml:space="preserve">Governance workflow. Each issuer is elicited</w:t>
+      </w:r>
+      <w:r>
+        <w:t xml:space="preserve"> </w:t>
+      </w:r>
+      <m:oMath>
+        <m:r>
+          <m:t>k</m:t>
+        </m:r>
+      </m:oMath>
+      <w:r>
+        <w:t xml:space="preserve"> </w:t>
+      </w:r>
+      <w:r>
+        <w:t xml:space="preserve">times; the modal rating and specification-instability</w:t>
+      </w:r>
+      <w:r>
+        <w:t xml:space="preserve"> </w:t>
+      </w:r>
+      <w:r>
+        <w:t xml:space="preserve">score are recorded; issuers that are both near a consequential boundary and unstable are routed to review.</w:t>
+      </w:r>
+      <w:bookmarkEnd w:id="51"/>
     </w:p>
     <w:p>
       <w:pPr>
@@ -8247,11 +8235,11 @@
       <w:pPr>
         <w:pStyle w:val="Heading1"/>
       </w:pPr>
-      <w:bookmarkStart w:id="56" w:name="discussion"/>
+      <w:bookmarkStart w:id="52" w:name="discussion"/>
       <w:r>
         <w:t xml:space="preserve">Discussion</w:t>
       </w:r>
-      <w:bookmarkEnd w:id="56"/>
+      <w:bookmarkEnd w:id="52"/>
     </w:p>
     <w:p>
       <w:pPr>
@@ -8527,11 +8515,11 @@
       <w:pPr>
         <w:pStyle w:val="Heading2"/>
       </w:pPr>
-      <w:bookmarkStart w:id="57" w:name="a-reusable-decontamination-protocol"/>
+      <w:bookmarkStart w:id="53" w:name="a-reusable-decontamination-protocol"/>
       <w:r>
         <w:t xml:space="preserve">A reusable decontamination protocol</w:t>
       </w:r>
-      <w:bookmarkEnd w:id="57"/>
+      <w:bookmarkEnd w:id="53"/>
     </w:p>
     <w:p>
       <w:pPr>
@@ -8619,11 +8607,11 @@
       <w:pPr>
         <w:pStyle w:val="Heading2"/>
       </w:pPr>
-      <w:bookmarkStart w:id="58" w:name="limitations"/>
+      <w:bookmarkStart w:id="54" w:name="limitations"/>
       <w:r>
         <w:t xml:space="preserve">Limitations</w:t>
       </w:r>
-      <w:bookmarkEnd w:id="58"/>
+      <w:bookmarkEnd w:id="54"/>
     </w:p>
     <w:p>
       <w:pPr>
@@ -8982,11 +8970,11 @@
       <w:pPr>
         <w:pStyle w:val="Heading2"/>
       </w:pPr>
-      <w:bookmarkStart w:id="59" w:name="future-directions"/>
+      <w:bookmarkStart w:id="55" w:name="future-directions"/>
       <w:r>
         <w:t xml:space="preserve">Future directions</w:t>
       </w:r>
-      <w:bookmarkEnd w:id="59"/>
+      <w:bookmarkEnd w:id="55"/>
     </w:p>
     <w:p>
       <w:pPr>
@@ -9104,21 +9092,21 @@
       <w:pPr>
         <w:pStyle w:val="Heading1"/>
       </w:pPr>
-      <w:bookmarkStart w:id="60" w:name="methods"/>
+      <w:bookmarkStart w:id="56" w:name="methods"/>
       <w:r>
         <w:t xml:space="preserve">Methods</w:t>
       </w:r>
-      <w:bookmarkEnd w:id="60"/>
+      <w:bookmarkEnd w:id="56"/>
     </w:p>
     <w:p>
       <w:pPr>
         <w:pStyle w:val="Heading2"/>
       </w:pPr>
-      <w:bookmarkStart w:id="61" w:name="design-battery-and-benchmark"/>
+      <w:bookmarkStart w:id="57" w:name="design-battery-and-benchmark"/>
       <w:r>
         <w:t xml:space="preserve">Design, battery, and benchmark</w:t>
       </w:r>
-      <w:bookmarkEnd w:id="61"/>
+      <w:bookmarkEnd w:id="57"/>
     </w:p>
     <w:p>
       <w:pPr>
@@ -9404,7 +9392,7 @@
         <w:t xml:space="preserve">classifications.</w:t>
       </w:r>
     </w:p>
-    <w:bookmarkStart w:id="62" w:name="tab:map"/>
+    <w:bookmarkStart w:id="58" w:name="tab:map"/>
     <w:p>
       <w:pPr>
         <w:pStyle w:val="TableCaption"/>
@@ -10538,7 +10526,7 @@
         </w:tc>
       </w:tr>
     </w:tbl>
-    <w:bookmarkEnd w:id="62"/>
+    <w:bookmarkEnd w:id="58"/>
     <w:p>
       <w:pPr>
         <w:pStyle w:val="BodyText"/>
@@ -10664,11 +10652,11 @@
       <w:pPr>
         <w:pStyle w:val="Heading2"/>
       </w:pPr>
-      <w:bookmarkStart w:id="63" w:name="specification-grid-and-data-collection"/>
+      <w:bookmarkStart w:id="59" w:name="specification-grid-and-data-collection"/>
       <w:r>
         <w:t xml:space="preserve">Specification grid and data collection</w:t>
       </w:r>
-      <w:bookmarkEnd w:id="63"/>
+      <w:bookmarkEnd w:id="59"/>
     </w:p>
     <w:p>
       <w:pPr>
@@ -10862,7 +10850,7 @@
         <w:t xml:space="preserve">corpus and do not re-query any model.</w:t>
       </w:r>
     </w:p>
-    <w:bookmarkStart w:id="64" w:name="tab:models"/>
+    <w:bookmarkStart w:id="60" w:name="tab:models"/>
     <w:p>
       <w:pPr>
         <w:pStyle w:val="TableCaption"/>
@@ -11210,7 +11198,7 @@
         </w:tc>
       </w:tr>
     </w:tbl>
-    <w:bookmarkEnd w:id="64"/>
+    <w:bookmarkEnd w:id="60"/>
     <w:p>
       <w:pPr>
         <w:pStyle w:val="BodyText"/>
@@ -11235,11 +11223,11 @@
       <w:pPr>
         <w:pStyle w:val="Heading2"/>
       </w:pPr>
-      <w:bookmarkStart w:id="65" w:name="X335739e5c0faa9978e4fea8c9e114a2f4c49f66"/>
+      <w:bookmarkStart w:id="61" w:name="X335739e5c0faa9978e4fea8c9e114a2f4c49f66"/>
       <w:r>
         <w:t xml:space="preserve">Outcome construction and statistical analysis</w:t>
       </w:r>
-      <w:bookmarkEnd w:id="65"/>
+      <w:bookmarkEnd w:id="61"/>
     </w:p>
     <w:p>
       <w:pPr>
@@ -11721,10 +11709,355 @@
       <w:pPr>
         <w:pStyle w:val="Heading2"/>
       </w:pPr>
-      <w:bookmarkStart w:id="66" w:name="economic-translation"/>
+      <w:bookmarkStart w:id="62" w:name="economic-translation"/>
       <w:r>
         <w:t xml:space="preserve">Economic translation</w:t>
       </w:r>
+      <w:bookmarkEnd w:id="62"/>
+    </w:p>
+    <w:p>
+      <w:pPr>
+        <w:pStyle w:val="FirstParagraph"/>
+      </w:pPr>
+      <w:r>
+        <w:t xml:space="preserve">The economic translations are post-hoc calibrations that express the magnitude of rating instability in</w:t>
+      </w:r>
+      <w:r>
+        <w:t xml:space="preserve"> </w:t>
+      </w:r>
+      <w:r>
+        <w:t xml:space="preserve">decision-relevant units; they are not confirmatory tests. Portfolio turnover is computed from the 45</w:t>
+      </w:r>
+      <w:r>
+        <w:t xml:space="preserve"> </w:t>
+      </w:r>
+      <w:r>
+        <w:t xml:space="preserve">directional profiles as the share of positions whose modal buy/hold/sell decision changes across</w:t>
+      </w:r>
+      <w:r>
+        <w:t xml:space="preserve"> </w:t>
+      </w:r>
+      <w:r>
+        <w:t xml:space="preserve">elicitation specifications. Rating dispersion is transformed into indicative credit-spread variation</w:t>
+      </w:r>
+      <w:r>
+        <w:t xml:space="preserve"> </w:t>
+      </w:r>
+      <w:r>
+        <w:t xml:space="preserve">using the rating-spread schedule of Cornaggia et al. (2018) and a cached daily option-adjusted-spread</w:t>
+      </w:r>
+      <w:r>
+        <w:t xml:space="preserve"> </w:t>
+      </w:r>
+      <w:r>
+        <w:t xml:space="preserve">series. For the regulatory-capital illustration, each specification’s rating is mapped through the Basel</w:t>
+      </w:r>
+      <w:r>
+        <w:t xml:space="preserve"> </w:t>
+      </w:r>
+      <w:r>
+        <w:t xml:space="preserve">CRE20 standardized external-ratings risk-weight schedule (Basel Committee on Banking Supervision, 2019) and applied to the same</w:t>
+      </w:r>
+      <w:r>
+        <w:t xml:space="preserve"> </w:t>
+      </w:r>
+      <w:r>
+        <w:t xml:space="preserve">hypothetical $45 billion equal-weight corporate portfolio, so that the capital range reflects only</w:t>
+      </w:r>
+      <w:r>
+        <w:t xml:space="preserve"> </w:t>
+      </w:r>
+      <w:r>
+        <w:t xml:space="preserve">differences in the elicited rating. The comparison with the Basel Regulatory Consistency Assessment</w:t>
+      </w:r>
+      <w:r>
+        <w:t xml:space="preserve"> </w:t>
+      </w:r>
+      <w:r>
+        <w:t xml:space="preserve">Programme (Basel Committee on Banking Supervision, 2013) is used only as a magnitude calibration, not as an identity between the two</w:t>
+      </w:r>
+      <w:r>
+        <w:t xml:space="preserve"> </w:t>
+      </w:r>
+      <w:r>
+        <w:t xml:space="preserve">settings.</w:t>
+      </w:r>
+    </w:p>
+    <w:p>
+      <w:pPr>
+        <w:pStyle w:val="Heading2"/>
+      </w:pPr>
+      <w:bookmarkStart w:id="63" w:name="real-firm-arm"/>
+      <w:r>
+        <w:t xml:space="preserve">Real-firm arm</w:t>
+      </w:r>
+      <w:bookmarkEnd w:id="63"/>
+    </w:p>
+    <w:p>
+      <w:pPr>
+        <w:pStyle w:val="FirstParagraph"/>
+      </w:pPr>
+      <w:r>
+        <w:t xml:space="preserve">To test the persistence of specification instability outside the constructed battery, we assemble a</w:t>
+      </w:r>
+      <w:r>
+        <w:t xml:space="preserve"> </w:t>
+      </w:r>
+      <w:r>
+        <w:t xml:space="preserve">complementary sample of 31 U.S. business-to-business issuers with market capitalizations between $2</w:t>
+      </w:r>
+      <w:r>
+        <w:t xml:space="preserve"> </w:t>
+      </w:r>
+      <w:r>
+        <w:t xml:space="preserve">billion and $15 billion whose most recent Form 10-K discloses a current long-term agency credit rating.</w:t>
+      </w:r>
+      <w:r>
+        <w:t xml:space="preserve"> </w:t>
+      </w:r>
+      <w:r>
+        <w:t xml:space="preserve">S&amp;P is the primary rating source; where S&amp;P ratings are unavailable, Moody’s or Fitch ratings are</w:t>
+      </w:r>
+      <w:r>
+        <w:t xml:space="preserve"> </w:t>
+      </w:r>
+      <w:r>
+        <w:t xml:space="preserve">mapped to a common scale. Each rating is preserved with a verbatim filing quotation, a permanent SEC</w:t>
+      </w:r>
+      <w:r>
+        <w:t xml:space="preserve"> </w:t>
+      </w:r>
+      <w:r>
+        <w:t xml:space="preserve">document URL, and a document hash.</w:t>
+      </w:r>
+    </w:p>
+    <w:p>
+      <w:pPr>
+        <w:pStyle w:val="BodyText"/>
+      </w:pPr>
+      <w:r>
+        <w:t xml:space="preserve">Because these figures are publicly reported by real issuers, there is a risk of contamination if a model</w:t>
+      </w:r>
+      <w:r>
+        <w:t xml:space="preserve"> </w:t>
+      </w:r>
+      <w:r>
+        <w:t xml:space="preserve">can identify a company. We therefore first perform a pre-registered fingerprinting test in which the</w:t>
+      </w:r>
+      <w:r>
+        <w:t xml:space="preserve"> </w:t>
+      </w:r>
+      <w:r>
+        <w:t xml:space="preserve">models are asked to identify issuers from anonymized financial profiles; Gemini-Flash identifies about</w:t>
+      </w:r>
+      <w:r>
+        <w:t xml:space="preserve"> </w:t>
+      </w:r>
+      <w:r>
+        <w:t xml:space="preserve">22% of the selected issuers from the original figures, confirming that removing the company name does not</w:t>
+      </w:r>
+      <w:r>
+        <w:t xml:space="preserve"> </w:t>
+      </w:r>
+      <w:r>
+        <w:t xml:space="preserve">guarantee independence from memorized issuer information. To reduce this risk, every dollar-denominated</w:t>
+      </w:r>
+      <w:r>
+        <w:t xml:space="preserve"> </w:t>
+      </w:r>
+      <w:r>
+        <w:t xml:space="preserve">quantity for an issuer is multiplied by a single issuer-specific factor sampled from a log-uniform</w:t>
+      </w:r>
+      <w:r>
+        <w:t xml:space="preserve"> </w:t>
+      </w:r>
+      <w:r>
+        <w:t xml:space="preserve">distribution over</w:t>
+      </w:r>
+      <w:r>
+        <w:t xml:space="preserve"> </w:t>
+      </w:r>
+      <m:oMath>
+        <m:r>
+          <m:t>[</m:t>
+        </m:r>
+        <m:r>
+          <m:t>0.6</m:t>
+        </m:r>
+        <m:r>
+          <m:t>,</m:t>
+        </m:r>
+        <m:r>
+          <m:t>1.7</m:t>
+        </m:r>
+        <m:r>
+          <m:t>]</m:t>
+        </m:r>
+      </m:oMath>
+      <w:r>
+        <w:t xml:space="preserve">. The same factor applies to all monetary amounts, so the credit-health</w:t>
+      </w:r>
+      <w:r>
+        <w:t xml:space="preserve"> </w:t>
+      </w:r>
+      <w:r>
+        <w:t xml:space="preserve">analysis retains the financial-ratio structure while disrupting exact-figure lookup. We also</w:t>
+      </w:r>
+      <w:r>
+        <w:t xml:space="preserve"> </w:t>
+      </w:r>
+      <w:r>
+        <w:t xml:space="preserve">exclude consumer-facing companies to reduce recognition from highly distinctive public profiles. The</w:t>
+      </w:r>
+      <w:r>
+        <w:t xml:space="preserve"> </w:t>
+      </w:r>
+      <w:r>
+        <w:t xml:space="preserve">fingerprint-identification rate falls to 2.9% after perturbation, below the pre-registered 5%</w:t>
+      </w:r>
+      <w:r>
+        <w:t xml:space="preserve"> </w:t>
+      </w:r>
+      <w:r>
+        <w:t xml:space="preserve">decontamination threshold.</w:t>
+      </w:r>
+    </w:p>
+    <w:p>
+      <w:pPr>
+        <w:pStyle w:val="BodyText"/>
+      </w:pPr>
+      <w:r>
+        <w:t xml:space="preserve">Each decontaminated issuer is then scored on a fixed 12-specification grid spanning presentation,</w:t>
+      </w:r>
+      <w:r>
+        <w:t xml:space="preserve"> </w:t>
+      </w:r>
+      <w:r>
+        <w:t xml:space="preserve">provider, prompt paraphrase, and output format, at three seeds, and the constructed battery is re-scored</w:t>
+      </w:r>
+      <w:r>
+        <w:t xml:space="preserve"> </w:t>
+      </w:r>
+      <w:r>
+        <w:t xml:space="preserve">under the same grid for a matched comparison on the WATCH stratum. This arm uses disclosed agency ratings</w:t>
+      </w:r>
+      <w:r>
+        <w:t xml:space="preserve"> </w:t>
+      </w:r>
+      <w:r>
+        <w:t xml:space="preserve">as a descriptive real-world reference; the primary comparison is stability across specifications.</w:t>
+      </w:r>
+    </w:p>
+    <w:p>
+      <w:pPr>
+        <w:pStyle w:val="Heading2"/>
+      </w:pPr>
+      <w:bookmarkStart w:id="64" w:name="reproducibility"/>
+      <w:r>
+        <w:t xml:space="preserve">Reproducibility</w:t>
+      </w:r>
+      <w:bookmarkEnd w:id="64"/>
+    </w:p>
+    <w:p>
+      <w:pPr>
+        <w:pStyle w:val="FirstParagraph"/>
+      </w:pPr>
+      <w:r>
+        <w:t xml:space="preserve">The entire experimental pipeline is archived so that the reported results can be reproduced without</w:t>
+      </w:r>
+      <w:r>
+        <w:t xml:space="preserve"> </w:t>
+      </w:r>
+      <w:r>
+        <w:t xml:space="preserve">further model calls. The frozen materials comprise the 90-item battery, the specification grid, the</w:t>
+      </w:r>
+      <w:r>
+        <w:t xml:space="preserve"> </w:t>
+      </w:r>
+      <w:r>
+        <w:t xml:space="preserve">prompt templates, the rating scale, the frozen response corpus, the analysis panel, the real-firm arm,</w:t>
+      </w:r>
+      <w:r>
+        <w:t xml:space="preserve"> </w:t>
+      </w:r>
+      <w:r>
+        <w:t xml:space="preserve">the analysis code, the generated outputs, and SHA-256 integrity manifests. The complete set of</w:t>
+      </w:r>
+      <w:r>
+        <w:t xml:space="preserve"> </w:t>
+      </w:r>
+      <w:r>
+        <w:t xml:space="preserve">confirmatory tables, figures, and reported statistics regenerates from a single offline entry point.</w:t>
+      </w:r>
+      <w:r>
+        <w:t xml:space="preserve"> </w:t>
+      </w:r>
+      <w:r>
+        <w:t xml:space="preserve">Provider API credentials are required only to collect new model responses and are not needed to reproduce</w:t>
+      </w:r>
+      <w:r>
+        <w:t xml:space="preserve"> </w:t>
+      </w:r>
+      <w:r>
+        <w:t xml:space="preserve">any result reported in this study.</w:t>
+      </w:r>
+    </w:p>
+    <w:p>
+      <w:pPr>
+        <w:pStyle w:val="Heading1"/>
+      </w:pPr>
+      <w:bookmarkStart w:id="65" w:name="X1f74eb43af444059c7518034463b6c89b1cacf4"/>
+      <w:r>
+        <w:t xml:space="preserve">Declaration of generative AI and AI-assisted technologies in the manuscript preparation process</w:t>
+      </w:r>
+      <w:bookmarkEnd w:id="65"/>
+    </w:p>
+    <w:p>
+      <w:pPr>
+        <w:pStyle w:val="FirstParagraph"/>
+      </w:pPr>
+      <w:r>
+        <w:t xml:space="preserve">Generative AI was used to assist with grammar correction and minor language edits of the authors’ own</w:t>
+      </w:r>
+      <w:r>
+        <w:t xml:space="preserve"> </w:t>
+      </w:r>
+      <w:r>
+        <w:t xml:space="preserve">text, and with software scaffolding, development, and coding of the analysis and reproducibility pipeline</w:t>
+      </w:r>
+      <w:r>
+        <w:t xml:space="preserve"> </w:t>
+      </w:r>
+      <w:r>
+        <w:t xml:space="preserve">(Anthropic Claude), in all cases under the authors’ direction. Separately, large language models are the</w:t>
+      </w:r>
+      <w:r>
+        <w:t xml:space="preserve"> </w:t>
+      </w:r>
+      <w:r>
+        <w:t xml:space="preserve">object of study in this work, the credit-rating elicitations under analysis, as described above; every</w:t>
+      </w:r>
+      <w:r>
+        <w:t xml:space="preserve"> </w:t>
+      </w:r>
+      <w:r>
+        <w:t xml:space="preserve">such elicitation is recorded in the specification grid and frozen corpus. The authors reviewed and</w:t>
+      </w:r>
+      <w:r>
+        <w:t xml:space="preserve"> </w:t>
+      </w:r>
+      <w:r>
+        <w:t xml:space="preserve">verified all such output and take full responsibility for the content.</w:t>
+      </w:r>
+    </w:p>
+    <w:p>
+      <w:pPr>
+        <w:pStyle w:val="Heading1"/>
+      </w:pPr>
+      <w:bookmarkStart w:id="66" w:name="declaration-of-competing-interest"/>
+      <w:r>
+        <w:t xml:space="preserve">Declaration of competing interest</w:t>
+      </w:r>
       <w:bookmarkEnd w:id="66"/>
     </w:p>
     <w:p>
@@ -11732,76 +12065,16 @@
         <w:pStyle w:val="FirstParagraph"/>
       </w:pPr>
       <w:r>
-        <w:t xml:space="preserve">The economic translations are post-hoc calibrations that express the magnitude of rating instability in</w:t>
-      </w:r>
-      <w:r>
-        <w:t xml:space="preserve"> </w:t>
-      </w:r>
-      <w:r>
-        <w:t xml:space="preserve">decision-relevant units; they are not confirmatory tests. Portfolio turnover is computed from the 45</w:t>
-      </w:r>
-      <w:r>
-        <w:t xml:space="preserve"> </w:t>
-      </w:r>
-      <w:r>
-        <w:t xml:space="preserve">directional profiles as the share of positions whose modal buy/hold/sell decision changes across</w:t>
-      </w:r>
-      <w:r>
-        <w:t xml:space="preserve"> </w:t>
-      </w:r>
-      <w:r>
-        <w:t xml:space="preserve">elicitation specifications. Rating dispersion is transformed into indicative credit-spread variation</w:t>
-      </w:r>
-      <w:r>
-        <w:t xml:space="preserve"> </w:t>
-      </w:r>
-      <w:r>
-        <w:t xml:space="preserve">using the rating-spread schedule of Cornaggia et al. (2018) and a cached daily option-adjusted-spread</w:t>
-      </w:r>
-      <w:r>
-        <w:t xml:space="preserve"> </w:t>
-      </w:r>
-      <w:r>
-        <w:t xml:space="preserve">series. For the regulatory-capital illustration, each specification’s rating is mapped through the Basel</w:t>
-      </w:r>
-      <w:r>
-        <w:t xml:space="preserve"> </w:t>
-      </w:r>
-      <w:r>
-        <w:t xml:space="preserve">CRE20 standardized external-ratings risk-weight schedule (Basel Committee on Banking Supervision, 2019) and applied to the same</w:t>
-      </w:r>
-      <w:r>
-        <w:t xml:space="preserve"> </w:t>
-      </w:r>
-      <w:r>
-        <w:t xml:space="preserve">hypothetical $45 billion equal-weight corporate portfolio, so that the capital range reflects only</w:t>
-      </w:r>
-      <w:r>
-        <w:t xml:space="preserve"> </w:t>
-      </w:r>
-      <w:r>
-        <w:t xml:space="preserve">differences in the elicited rating. The comparison with the Basel Regulatory Consistency Assessment</w:t>
-      </w:r>
-      <w:r>
-        <w:t xml:space="preserve"> </w:t>
-      </w:r>
-      <w:r>
-        <w:t xml:space="preserve">Programme (Basel Committee on Banking Supervision, 2013) is used only as a magnitude calibration, not as an identity between the two</w:t>
-      </w:r>
-      <w:r>
-        <w:t xml:space="preserve"> </w:t>
-      </w:r>
-      <w:r>
-        <w:t xml:space="preserve">settings.</w:t>
-      </w:r>
-    </w:p>
-    <w:p>
-      <w:pPr>
-        <w:pStyle w:val="Heading2"/>
-      </w:pPr>
-      <w:bookmarkStart w:id="67" w:name="real-firm-arm"/>
-      <w:r>
-        <w:t xml:space="preserve">Real-firm arm</w:t>
+        <w:t xml:space="preserve">S.C. and R.C. each declare no competing interests.</w:t>
+      </w:r>
+    </w:p>
+    <w:p>
+      <w:pPr>
+        <w:pStyle w:val="Heading1"/>
+      </w:pPr>
+      <w:bookmarkStart w:id="67" w:name="funding"/>
+      <w:r>
+        <w:t xml:space="preserve">Funding</w:t>
       </w:r>
       <w:bookmarkEnd w:id="67"/>
     </w:p>
@@ -11810,163 +12083,16 @@
         <w:pStyle w:val="FirstParagraph"/>
       </w:pPr>
       <w:r>
-        <w:t xml:space="preserve">To test the persistence of specification instability outside the constructed battery, we assemble a</w:t>
-      </w:r>
-      <w:r>
-        <w:t xml:space="preserve"> </w:t>
-      </w:r>
-      <w:r>
-        <w:t xml:space="preserve">complementary sample of 31 U.S. business-to-business issuers with market capitalizations between $2</w:t>
-      </w:r>
-      <w:r>
-        <w:t xml:space="preserve"> </w:t>
-      </w:r>
-      <w:r>
-        <w:t xml:space="preserve">billion and $15 billion whose most recent Form 10-K discloses a current long-term agency credit rating.</w:t>
-      </w:r>
-      <w:r>
-        <w:t xml:space="preserve"> </w:t>
-      </w:r>
-      <w:r>
-        <w:t xml:space="preserve">S&amp;P is the primary rating source; where S&amp;P ratings are unavailable, Moody’s or Fitch ratings are</w:t>
-      </w:r>
-      <w:r>
-        <w:t xml:space="preserve"> </w:t>
-      </w:r>
-      <w:r>
-        <w:t xml:space="preserve">mapped to a common scale. Each rating is preserved with a verbatim filing quotation, a permanent SEC</w:t>
-      </w:r>
-      <w:r>
-        <w:t xml:space="preserve"> </w:t>
-      </w:r>
-      <w:r>
-        <w:t xml:space="preserve">document URL, and a document hash.</w:t>
-      </w:r>
-    </w:p>
-    <w:p>
-      <w:pPr>
-        <w:pStyle w:val="BodyText"/>
-      </w:pPr>
-      <w:r>
-        <w:t xml:space="preserve">Because these figures are publicly reported by real issuers, there is a risk of contamination if a model</w:t>
-      </w:r>
-      <w:r>
-        <w:t xml:space="preserve"> </w:t>
-      </w:r>
-      <w:r>
-        <w:t xml:space="preserve">can identify a company. We therefore first perform a pre-registered fingerprinting test in which the</w:t>
-      </w:r>
-      <w:r>
-        <w:t xml:space="preserve"> </w:t>
-      </w:r>
-      <w:r>
-        <w:t xml:space="preserve">models are asked to identify issuers from anonymized financial profiles; Gemini-Flash identifies about</w:t>
-      </w:r>
-      <w:r>
-        <w:t xml:space="preserve"> </w:t>
-      </w:r>
-      <w:r>
-        <w:t xml:space="preserve">22% of the selected issuers from the original figures, confirming that removing the company name does not</w:t>
-      </w:r>
-      <w:r>
-        <w:t xml:space="preserve"> </w:t>
-      </w:r>
-      <w:r>
-        <w:t xml:space="preserve">guarantee independence from memorized issuer information. To reduce this risk, every dollar-denominated</w:t>
-      </w:r>
-      <w:r>
-        <w:t xml:space="preserve"> </w:t>
-      </w:r>
-      <w:r>
-        <w:t xml:space="preserve">quantity for an issuer is multiplied by a single issuer-specific factor sampled from a log-uniform</w:t>
-      </w:r>
-      <w:r>
-        <w:t xml:space="preserve"> </w:t>
-      </w:r>
-      <w:r>
-        <w:t xml:space="preserve">distribution over</w:t>
-      </w:r>
-      <w:r>
-        <w:t xml:space="preserve"> </w:t>
-      </w:r>
-      <m:oMath>
-        <m:r>
-          <m:t>[</m:t>
-        </m:r>
-        <m:r>
-          <m:t>0.6</m:t>
-        </m:r>
-        <m:r>
-          <m:t>,</m:t>
-        </m:r>
-        <m:r>
-          <m:t>1.7</m:t>
-        </m:r>
-        <m:r>
-          <m:t>]</m:t>
-        </m:r>
-      </m:oMath>
-      <w:r>
-        <w:t xml:space="preserve">. The same factor applies to all monetary amounts, so the credit-health</w:t>
-      </w:r>
-      <w:r>
-        <w:t xml:space="preserve"> </w:t>
-      </w:r>
-      <w:r>
-        <w:t xml:space="preserve">analysis retains the financial-ratio structure while disrupting exact-figure lookup. We also</w:t>
-      </w:r>
-      <w:r>
-        <w:t xml:space="preserve"> </w:t>
-      </w:r>
-      <w:r>
-        <w:t xml:space="preserve">exclude consumer-facing companies to reduce recognition from highly distinctive public profiles. The</w:t>
-      </w:r>
-      <w:r>
-        <w:t xml:space="preserve"> </w:t>
-      </w:r>
-      <w:r>
-        <w:t xml:space="preserve">fingerprint-identification rate falls to 2.9% after perturbation, below the pre-registered 5%</w:t>
-      </w:r>
-      <w:r>
-        <w:t xml:space="preserve"> </w:t>
-      </w:r>
-      <w:r>
-        <w:t xml:space="preserve">decontamination threshold.</w:t>
-      </w:r>
-    </w:p>
-    <w:p>
-      <w:pPr>
-        <w:pStyle w:val="BodyText"/>
-      </w:pPr>
-      <w:r>
-        <w:t xml:space="preserve">Each decontaminated issuer is then scored on a fixed 12-specification grid spanning presentation,</w:t>
-      </w:r>
-      <w:r>
-        <w:t xml:space="preserve"> </w:t>
-      </w:r>
-      <w:r>
-        <w:t xml:space="preserve">provider, prompt paraphrase, and output format, at three seeds, and the constructed battery is re-scored</w:t>
-      </w:r>
-      <w:r>
-        <w:t xml:space="preserve"> </w:t>
-      </w:r>
-      <w:r>
-        <w:t xml:space="preserve">under the same grid for a matched comparison on the WATCH stratum. This arm uses disclosed agency ratings</w:t>
-      </w:r>
-      <w:r>
-        <w:t xml:space="preserve"> </w:t>
-      </w:r>
-      <w:r>
-        <w:t xml:space="preserve">as a descriptive real-world reference; the primary comparison is stability across specifications.</w:t>
-      </w:r>
-    </w:p>
-    <w:p>
-      <w:pPr>
-        <w:pStyle w:val="Heading2"/>
-      </w:pPr>
-      <w:bookmarkStart w:id="68" w:name="reproducibility"/>
-      <w:r>
-        <w:t xml:space="preserve">Reproducibility</w:t>
+        <w:t xml:space="preserve">This research received no external funding.</w:t>
+      </w:r>
+    </w:p>
+    <w:p>
+      <w:pPr>
+        <w:pStyle w:val="Heading1"/>
+      </w:pPr>
+      <w:bookmarkStart w:id="68" w:name="ethics"/>
+      <w:r>
+        <w:t xml:space="preserve">Ethics</w:t>
       </w:r>
       <w:bookmarkEnd w:id="68"/>
     </w:p>
@@ -11975,52 +12101,34 @@
         <w:pStyle w:val="FirstParagraph"/>
       </w:pPr>
       <w:r>
-        <w:t xml:space="preserve">The entire experimental pipeline is archived so that the reported results can be reproduced without</w:t>
-      </w:r>
-      <w:r>
-        <w:t xml:space="preserve"> </w:t>
-      </w:r>
-      <w:r>
-        <w:t xml:space="preserve">further model calls. The frozen materials comprise the 90-item battery, the specification grid, the</w:t>
-      </w:r>
-      <w:r>
-        <w:t xml:space="preserve"> </w:t>
-      </w:r>
-      <w:r>
-        <w:t xml:space="preserve">prompt templates, the rating scale, the frozen response corpus, the analysis panel, the real-firm arm,</w:t>
-      </w:r>
-      <w:r>
-        <w:t xml:space="preserve"> </w:t>
-      </w:r>
-      <w:r>
-        <w:t xml:space="preserve">the analysis code, the generated outputs, and SHA-256 integrity manifests. The complete set of</w:t>
-      </w:r>
-      <w:r>
-        <w:t xml:space="preserve"> </w:t>
-      </w:r>
-      <w:r>
-        <w:t xml:space="preserve">confirmatory tables, figures, and reported statistics regenerates from a single offline entry point.</w:t>
-      </w:r>
-      <w:r>
-        <w:t xml:space="preserve"> </w:t>
-      </w:r>
-      <w:r>
-        <w:t xml:space="preserve">Provider API credentials are required only to collect new model responses and are not needed to reproduce</w:t>
-      </w:r>
-      <w:r>
-        <w:t xml:space="preserve"> </w:t>
-      </w:r>
-      <w:r>
-        <w:t xml:space="preserve">any result reported in this study.</w:t>
+        <w:t xml:space="preserve">This study did not involve human participants, human tissue, or animal subjects, and used no personally</w:t>
+      </w:r>
+      <w:r>
+        <w:t xml:space="preserve"> </w:t>
+      </w:r>
+      <w:r>
+        <w:t xml:space="preserve">identifiable or sensitive personal data; ethical approval was therefore not required. The analysis uses</w:t>
+      </w:r>
+      <w:r>
+        <w:t xml:space="preserve"> </w:t>
+      </w:r>
+      <w:r>
+        <w:t xml:space="preserve">only synthetic firm profiles, publicly available corporate financial disclosures (SEC filings), and the</w:t>
+      </w:r>
+      <w:r>
+        <w:t xml:space="preserve"> </w:t>
+      </w:r>
+      <w:r>
+        <w:t xml:space="preserve">authors’ own model elicitations.</w:t>
       </w:r>
     </w:p>
     <w:p>
       <w:pPr>
         <w:pStyle w:val="Heading1"/>
       </w:pPr>
-      <w:bookmarkStart w:id="69" w:name="X1f74eb43af444059c7518034463b6c89b1cacf4"/>
-      <w:r>
-        <w:t xml:space="preserve">Declaration of generative AI and AI-assisted technologies in the manuscript preparation process</w:t>
+      <w:bookmarkStart w:id="69" w:name="data-availability"/>
+      <w:r>
+        <w:t xml:space="preserve">Data availability</w:t>
       </w:r>
       <w:bookmarkEnd w:id="69"/>
     </w:p>
@@ -12029,126 +12137,6 @@
         <w:pStyle w:val="FirstParagraph"/>
       </w:pPr>
       <w:r>
-        <w:t xml:space="preserve">Generative AI was used to assist with grammar correction and minor language edits of the authors’ own</w:t>
-      </w:r>
-      <w:r>
-        <w:t xml:space="preserve"> </w:t>
-      </w:r>
-      <w:r>
-        <w:t xml:space="preserve">text, and with software scaffolding, development, and coding of the analysis and reproducibility pipeline</w:t>
-      </w:r>
-      <w:r>
-        <w:t xml:space="preserve"> </w:t>
-      </w:r>
-      <w:r>
-        <w:t xml:space="preserve">(Anthropic Claude), in all cases under the authors’ direction. Separately, large language models are the</w:t>
-      </w:r>
-      <w:r>
-        <w:t xml:space="preserve"> </w:t>
-      </w:r>
-      <w:r>
-        <w:t xml:space="preserve">object of study in this work, the credit-rating elicitations under analysis, as described above; every</w:t>
-      </w:r>
-      <w:r>
-        <w:t xml:space="preserve"> </w:t>
-      </w:r>
-      <w:r>
-        <w:t xml:space="preserve">such elicitation is recorded in the specification grid and frozen corpus. The authors reviewed and</w:t>
-      </w:r>
-      <w:r>
-        <w:t xml:space="preserve"> </w:t>
-      </w:r>
-      <w:r>
-        <w:t xml:space="preserve">verified all such output and take full responsibility for the content.</w:t>
-      </w:r>
-    </w:p>
-    <w:p>
-      <w:pPr>
-        <w:pStyle w:val="Heading1"/>
-      </w:pPr>
-      <w:bookmarkStart w:id="70" w:name="declaration-of-competing-interest"/>
-      <w:r>
-        <w:t xml:space="preserve">Declaration of competing interest</w:t>
-      </w:r>
-      <w:bookmarkEnd w:id="70"/>
-    </w:p>
-    <w:p>
-      <w:pPr>
-        <w:pStyle w:val="FirstParagraph"/>
-      </w:pPr>
-      <w:r>
-        <w:t xml:space="preserve">S.C. and R.C. each declare no competing interests.</w:t>
-      </w:r>
-    </w:p>
-    <w:p>
-      <w:pPr>
-        <w:pStyle w:val="Heading1"/>
-      </w:pPr>
-      <w:bookmarkStart w:id="71" w:name="funding"/>
-      <w:r>
-        <w:t xml:space="preserve">Funding</w:t>
-      </w:r>
-      <w:bookmarkEnd w:id="71"/>
-    </w:p>
-    <w:p>
-      <w:pPr>
-        <w:pStyle w:val="FirstParagraph"/>
-      </w:pPr>
-      <w:r>
-        <w:t xml:space="preserve">This research received no external funding.</w:t>
-      </w:r>
-    </w:p>
-    <w:p>
-      <w:pPr>
-        <w:pStyle w:val="Heading1"/>
-      </w:pPr>
-      <w:bookmarkStart w:id="72" w:name="ethics"/>
-      <w:r>
-        <w:t xml:space="preserve">Ethics</w:t>
-      </w:r>
-      <w:bookmarkEnd w:id="72"/>
-    </w:p>
-    <w:p>
-      <w:pPr>
-        <w:pStyle w:val="FirstParagraph"/>
-      </w:pPr>
-      <w:r>
-        <w:t xml:space="preserve">This study did not involve human participants, human tissue, or animal subjects, and used no personally</w:t>
-      </w:r>
-      <w:r>
-        <w:t xml:space="preserve"> </w:t>
-      </w:r>
-      <w:r>
-        <w:t xml:space="preserve">identifiable or sensitive personal data; ethical approval was therefore not required. The analysis uses</w:t>
-      </w:r>
-      <w:r>
-        <w:t xml:space="preserve"> </w:t>
-      </w:r>
-      <w:r>
-        <w:t xml:space="preserve">only synthetic firm profiles, publicly available corporate financial disclosures (SEC filings), and the</w:t>
-      </w:r>
-      <w:r>
-        <w:t xml:space="preserve"> </w:t>
-      </w:r>
-      <w:r>
-        <w:t xml:space="preserve">authors’ own model elicitations.</w:t>
-      </w:r>
-    </w:p>
-    <w:p>
-      <w:pPr>
-        <w:pStyle w:val="Heading1"/>
-      </w:pPr>
-      <w:bookmarkStart w:id="73" w:name="data-availability"/>
-      <w:r>
-        <w:t xml:space="preserve">Data availability</w:t>
-      </w:r>
-      <w:bookmarkEnd w:id="73"/>
-    </w:p>
-    <w:p>
-      <w:pPr>
-        <w:pStyle w:val="FirstParagraph"/>
-      </w:pPr>
-      <w:r>
         <w:t xml:space="preserve">All data and code required to reproduce the study are openly available in a deterministic, offline</w:t>
       </w:r>
       <w:r>
@@ -12163,7 +12151,7 @@
       <w:r>
         <w:t xml:space="preserve">(</w:t>
       </w:r>
-      <w:hyperlink r:id="rId74">
+      <w:hyperlink r:id="rId70">
         <w:r>
           <w:rPr>
             <w:rStyle w:val="Hyperlink"/>
@@ -12177,7 +12165,7 @@
       <w:r>
         <w:t xml:space="preserve"> </w:t>
       </w:r>
-      <w:hyperlink r:id="rId75">
+      <w:hyperlink r:id="rId71">
         <w:r>
           <w:rPr>
             <w:rStyle w:val="Hyperlink"/>
@@ -12491,11 +12479,11 @@
       <w:pPr>
         <w:pStyle w:val="Heading1"/>
       </w:pPr>
-      <w:bookmarkStart w:id="76" w:name="references"/>
+      <w:bookmarkStart w:id="72" w:name="references"/>
       <w:r>
         <w:t xml:space="preserve">References</w:t>
       </w:r>
-      <w:bookmarkEnd w:id="76"/>
+      <w:bookmarkEnd w:id="72"/>
     </w:p>
     <w:p>
       <w:pPr>
@@ -12528,7 +12516,7 @@
         <w:t xml:space="preserve"> </w:t>
       </w:r>
       <w:r>
-        <w:t xml:space="preserve">LLM settings.</w:t>
+        <w:t xml:space="preserve">LLM settings. arXiv:2408.04667.</w:t>
       </w:r>
     </w:p>
     <w:p>
@@ -12536,7 +12524,7 @@
         <w:pStyle w:val="BodyText"/>
       </w:pPr>
       <w:r>
-        <w:t xml:space="preserve">Basel Committee on Banking Supervision (2013). Regulatory Consistency Assessment Programme (RCAP): Analysis of risk-weighted assets for credit risk in the banking book.</w:t>
+        <w:t xml:space="preserve">Basel Committee on Banking Supervision (2013). Regulatory Consistency Assessment Programme (RCAP): Analysis of risk-weighted assets for credit risk in the banking book. Bank for International Settlements.</w:t>
       </w:r>
     </w:p>
     <w:p>
@@ -12544,7 +12532,7 @@
         <w:pStyle w:val="BodyText"/>
       </w:pPr>
       <w:r>
-        <w:t xml:space="preserve">Basel Committee on Banking Supervision (2019). CRE20: Standardised approach: individual exposures.</w:t>
+        <w:t xml:space="preserve">Basel Committee on Banking Supervision (2019). CRE20: Standardised approach: individual exposures. Basel Framework, Bank for International Settlements.</w:t>
       </w:r>
     </w:p>
     <w:p>
@@ -12552,7 +12540,7 @@
         <w:pStyle w:val="BodyText"/>
       </w:pPr>
       <w:r>
-        <w:t xml:space="preserve">Board of Governors of the Federal Reserve System, Currency (2011). Supervisory guidance on model risk management.</w:t>
+        <w:t xml:space="preserve">Board of Governors of the Federal Reserve System, Currency (2011). Supervisory guidance on model risk management. SR Letter 11-7 / OCC Bulletin 2011-12.</w:t>
       </w:r>
     </w:p>
     <w:p>
@@ -12576,7 +12564,7 @@
         <w:pStyle w:val="BodyText"/>
       </w:pPr>
       <w:r>
-        <w:t xml:space="preserve">Camuffo, Gambardella, Kazemi, Malachowski, Pandey (2026). Variance-aware LLM annotation for strategy research: Sources, diagnostics, and a protocol for reliable measurement.</w:t>
+        <w:t xml:space="preserve">Camuffo, Gambardella, Kazemi, Malachowski, Pandey (2026). Variance-aware LLM annotation for strategy research: Sources, diagnostics, and a protocol for reliable measurement. arXiv:2601.02370.</w:t>
       </w:r>
     </w:p>
     <w:p>
@@ -12679,14 +12667,6 @@
       </w:pPr>
       <w:r>
         <w:t xml:space="preserve">Kaplan, McCandlish, Henighan, Brown, Chess, Child, Gray, Radford, Wu, Amodei (2020). Scaling laws for neural language models. arXiv preprint arXiv:2001.08361.</w:t>
-      </w:r>
-    </w:p>
-    <w:p>
-      <w:pPr>
-        <w:pStyle w:val="BodyText"/>
-      </w:pPr>
-      <w:r>
-        <w:t xml:space="preserve">Kim, Muhn, Nikolaev (2024). Financial statement analysis with large language models. arXiv preprint arXiv:2407.17866.</w:t>
       </w:r>
     </w:p>
     <w:p>

</xml_diff>